<commit_message>
docs: reassess reviewer item 2 using confirmed manuscript parameters
</commit_message>
<xml_diff>
--- a/论文修改/修改说明.docx
+++ b/论文修改/修改说明.docx
@@ -295,7 +295,10 @@
     </w:p>
     <w:p>
       <w:r>
-        <w:t>主要修改位于修订稿第2.2.1节、式(1)—式(7)及新增图2；关联位置见上文第5点。原式(4)—式(9)顺延为式(8)—式(13)，对应文字引用同步更新。全部新写和修改内容直接标红，未使用修订模式。原表1—表9及其中数据保持不变，训练配置和实验指标未因本次频率换算核验而重新估计。</w:t>
+        <w:rPr>
+          <w:color w:val="FF0000"/>
+        </w:rPr>
+        <w:t>主要修改位于修订稿第2.2.1节、式(1)—式(7)及新增图2；关联修改包括中英文摘要、第1.5节、第2.1节、第2.2节引导段、第2.2.2节、第3.4节和第3.7.2节。原式(4)—式(9)顺延为式(8)—式(13)，对应文字引用同步更新。全部新写和修改内容直接标红，未使用修订模式。原表1—表9及其中数据保持不变，训练配置和实验指标未因本次频率换算核验而重新估计。</w:t>
       </w:r>
     </w:p>
     <w:sectPr>

</xml_diff>